<commit_message>
Guides : chantiers et gestion immobilière, session de Rotations
L'offre prévoit une formation et un guide par profil, chantiers et
immobilier compris : les deux guides manquaient. Le guide de
l'exploitation décrit la durée de session du téléphone et ce que la
déconnexion efface.

Co-Authored-By: Claude Opus 5.5 <noreply@anthropic.com>
</commit_message>
<xml_diff>
--- a/docs/guides/word/Guide_exploitation.docx
+++ b/docs/guides/word/Guide_exploitation.docx
@@ -11,7 +11,7 @@
           <wp:inline distT="0" distB="0" distL="0" distR="0">
             <wp:extent cx="1428750" cy="476250"/>
             <wp:effectExtent t="0" r="0" b="0" l="0"/>
-            <wp:docPr id="4" name="" descr="" title=""/>
+            <wp:docPr id="5" name="" descr="" title=""/>
             <wp:cNvGraphicFramePr>
               <a:graphicFrameLocks xmlns:a="http://schemas.openxmlformats.org/drawingml/2006/main" noChangeAspect="1"/>
             </wp:cNvGraphicFramePr>
@@ -676,7 +676,7 @@
           <w:sz w:val="20"/>
           <w:szCs w:val="20"/>
         </w:rPr>
-        <w:t xml:space="preserve">La session du téléphone dure 30 jours ; ensuite, se reconnecter avec du réseau.</w:t>
+        <w:t xml:space="preserve">La session du téléphone dure 30 jours sans retour au réseau, 90 jours au plus ; ensuite, se reconnecter avec du réseau. « Se déconnecter » efface du téléphone les listes et la page gardée pour l'usage hors réseau ; les saisies non envoyées restent et partiront à la prochaine connexion de leur auteur. Le téléphone ne garde ni tarifs ni marges.</w:t>
       </w:r>
     </w:p>
     <w:sectPr>

</xml_diff>

<commit_message>
Transport : application à part entière (NIMOVA · Transport)
Décision du gérant : le transport est un module comme Finance et AxisPro
Suite. Noyau : application « transport » (administration, direction,
finance, exploitation ; EGUITRA GROUP), liens des alertes et des constats
d'Analyse vers ses pages. Web : espace /transport (accent ambre) avec
tableau de bord, rotations, manquants, rentabilité, propriétaires et
répartition, taxes, flotte, routes et tarifs, paramètres ; écrans en
composants partagés ; registre, navigation, accueil, bascule, passerelle et
garde des pages ; /finance/transport redirige. Contrôle du tiers
propriétaire ou bénéficiaire (lisible, commun ou de la société), suite à
la revue de sécurité. Guides, dossier de conception, cahier de recette et
maquette d'API à jour.

Co-Authored-By: Claude Opus 5.5 <noreply@anthropic.com>
</commit_message>
<xml_diff>
--- a/docs/guides/word/Guide_exploitation.docx
+++ b/docs/guides/word/Guide_exploitation.docx
@@ -11,7 +11,7 @@
           <wp:inline distT="0" distB="0" distL="0" distR="0">
             <wp:extent cx="1428750" cy="476250"/>
             <wp:effectExtent t="0" r="0" b="0" l="0"/>
-            <wp:docPr id="6" name="" descr="" title=""/>
+            <wp:docPr id="7" name="" descr="" title=""/>
             <wp:cNvGraphicFramePr>
               <a:graphicFrameLocks xmlns:a="http://schemas.openxmlformats.org/drawingml/2006/main" noChangeAspect="1"/>
             </wp:cNvGraphicFramePr>
@@ -278,7 +278,38 @@
           <w:sz w:val="26"/>
           <w:szCs w:val="26"/>
         </w:rPr>
-        <w:t xml:space="preserve">Au bureau (EGUITRA Finance &gt; Métiers &gt; Transport)</w:t>
+        <w:t xml:space="preserve">Au bureau : l'application NIMOVA · Transport</w:t>
+      </w:r>
+    </w:p>
+    <w:p>
+      <w:pPr>
+        <w:spacing w:after="100"/>
+        <w:jc w:val="both"/>
+      </w:pPr>
+      <w:r>
+        <w:rPr>
+          <w:rFonts w:ascii="Calibri" w:cs="Calibri" w:eastAsia="Calibri" w:hAnsi="Calibri"/>
+          <w:sz w:val="20"/>
+          <w:szCs w:val="20"/>
+        </w:rPr>
+        <w:t xml:space="preserve">Transport est une application à part entière, comme Finance et AxisPro Suite : elle s'ouvre depuis l'accueil NIMOVA (rayon Transport) ou par l'adresse </w:t>
+      </w:r>
+      <w:r>
+        <w:rPr>
+          <w:rFonts w:ascii="Consolas" w:cs="Consolas" w:eastAsia="Consolas" w:hAnsi="Consolas"/>
+          <w:color w:val="333333"/>
+          <w:sz w:val="18"/>
+          <w:szCs w:val="18"/>
+        </w:rPr>
+        <w:t xml:space="preserve">/transport</w:t>
+      </w:r>
+      <w:r>
+        <w:rPr>
+          <w:rFonts w:ascii="Calibri" w:cs="Calibri" w:eastAsia="Calibri" w:hAnsi="Calibri"/>
+          <w:sz w:val="20"/>
+          <w:szCs w:val="20"/>
+        </w:rPr>
+        <w:t xml:space="preserve">, avec les mêmes identifiants. Ses menus : Exploitation (tableau de bord, rotations, manquants), Gestion (rentabilité, propriétaires et répartition, taxes spécifiques), Référentiels (flotte et chauffeurs, routes et tarifs, paramètres).</w:t>
       </w:r>
     </w:p>
     <w:p>
@@ -307,7 +338,7 @@
           <w:sz w:val="20"/>
           <w:szCs w:val="20"/>
         </w:rPr>
-        <w:t xml:space="preserve">Référentiels : ensembles routiers (capacité, année, mise en service), chauffeurs (avec leur fiche tiers), routes (aller, aller-retour, durée) et tarifs par client.</w:t>
+        <w:t xml:space="preserve">Tableau de bord : volume livré du mois au compteur, état de la flotte, chiffre d'affaires, marge, à facturer, saisies à valider, contrôles de la flotte et des rotations, rotations à traiter.</w:t>
       </w:r>
     </w:p>
     <w:p>
@@ -336,7 +367,7 @@
           <w:sz w:val="20"/>
           <w:szCs w:val="20"/>
         </w:rPr>
-        <w:t xml:space="preserve">Rotations : saisie, correction, puis « Valider » (volume et tarif requis ; un volume chargé au-delà de la capacité de la citerne est refusé, corriger le volume ou la capacité).</w:t>
+        <w:t xml:space="preserve">Référentiels : ensembles routiers (capacité, année, mise en service, propriété et charges mensuelles, tenues par la finance), chauffeurs (avec leur fiche tiers), routes (aller, aller-retour, durée, forfaits de référence : carburant, prime de route, péages, autres frais), prix du carburant et tarifs par client.</w:t>
       </w:r>
     </w:p>
     <w:p>
@@ -365,6 +396,35 @@
           <w:sz w:val="20"/>
           <w:szCs w:val="20"/>
         </w:rPr>
+        <w:t xml:space="preserve">Rotations : saisie, correction, puis « Valider » (volume et tarif requis ; un volume chargé au-delà de la capacité de la citerne est refusé, corriger le volume ou la capacité). Le formulaire affiche le montant, le coût standard de la route et la marge estimée avant l'enregistrement ; la liste montre la marge estimée tant qu'aucun frais n'est saisi.</w:t>
+      </w:r>
+    </w:p>
+    <w:p>
+      <w:pPr>
+        <w:tabs>
+          <w:tab w:val="left" w:pos="360"/>
+        </w:tabs>
+        <w:spacing w:after="60"/>
+        <w:ind w:left="360" w:hanging="360"/>
+        <w:jc w:val="both"/>
+      </w:pPr>
+      <w:r>
+        <w:rPr>
+          <w:rFonts w:ascii="Calibri" w:cs="Calibri" w:eastAsia="Calibri" w:hAnsi="Calibri"/>
+          <w:b/>
+          <w:bCs/>
+          <w:color w:val="1A9E9E"/>
+          <w:sz w:val="20"/>
+          <w:szCs w:val="20"/>
+        </w:rPr>
+        <w:t xml:space="preserve">•	</w:t>
+      </w:r>
+      <w:r>
+        <w:rPr>
+          <w:rFonts w:ascii="Calibri" w:cs="Calibri" w:eastAsia="Calibri" w:hAnsi="Calibri"/>
+          <w:sz w:val="20"/>
+          <w:szCs w:val="20"/>
+        </w:rPr>
         <w:t xml:space="preserve">Facturation : sélectionner les rotations validées d'un client, puis « Facturer » : une facture par client, une ligne par rotation, suivie des taxes refacturées et de la déduction du manquant hors tolérance selon les conditions du client.</w:t>
       </w:r>
     </w:p>
@@ -452,7 +512,36 @@
           <w:sz w:val="20"/>
           <w:szCs w:val="20"/>
         </w:rPr>
-        <w:t xml:space="preserve">Contrôles de la flotte (onglet Rentabilité) : ensemble sans immobilisation, chauffeur habituel de plusieurs ensembles, aller-retour incohérent, route sans distance.</w:t>
+        <w:t xml:space="preserve">Contrôles de la flotte (tableau de bord et Rentabilité) : ensemble sans immobilisation, chauffeur habituel de plusieurs ensembles, aller-retour incohérent, route sans distance, carburant de référence incohérent avec les autres routes.</w:t>
+      </w:r>
+    </w:p>
+    <w:p>
+      <w:pPr>
+        <w:tabs>
+          <w:tab w:val="left" w:pos="360"/>
+        </w:tabs>
+        <w:spacing w:after="60"/>
+        <w:ind w:left="360" w:hanging="360"/>
+        <w:jc w:val="both"/>
+      </w:pPr>
+      <w:r>
+        <w:rPr>
+          <w:rFonts w:ascii="Calibri" w:cs="Calibri" w:eastAsia="Calibri" w:hAnsi="Calibri"/>
+          <w:b/>
+          <w:bCs/>
+          <w:color w:val="1A9E9E"/>
+          <w:sz w:val="20"/>
+          <w:szCs w:val="20"/>
+        </w:rPr>
+        <w:t xml:space="preserve">•	</w:t>
+      </w:r>
+      <w:r>
+        <w:rPr>
+          <w:rFonts w:ascii="Calibri" w:cs="Calibri" w:eastAsia="Calibri" w:hAnsi="Calibri"/>
+          <w:sz w:val="20"/>
+          <w:szCs w:val="20"/>
+        </w:rPr>
+        <w:t xml:space="preserve">Propriétaires et répartition (direction et finance) : relevés mensuels des ensembles gérés pour des propriétaires, commissions, pièces ; voir le guide de la finance.</w:t>
       </w:r>
     </w:p>
     <w:p>

</xml_diff>

<commit_message>
Guide de l'exploitation : tri des rotations, pages et réseau faible de Rotations
Co-Authored-By: Claude Opus 5.5 <noreply@anthropic.com>
</commit_message>
<xml_diff>
--- a/docs/guides/word/Guide_exploitation.docx
+++ b/docs/guides/word/Guide_exploitation.docx
@@ -396,7 +396,7 @@
           <w:sz w:val="20"/>
           <w:szCs w:val="20"/>
         </w:rPr>
-        <w:t xml:space="preserve">Rotations : saisie, correction, puis « Valider » (volume et tarif requis ; un volume chargé au-delà de la capacité de la citerne est refusé, corriger le volume ou la capacité). Le formulaire affiche le montant, le coût standard de la route et la marge estimée avant l'enregistrement ; la liste montre la marge estimée tant qu'aucun frais n'est saisi.</w:t>
+        <w:t xml:space="preserve">Rotations : saisie, correction, puis « Valider » (volume et tarif requis ; un volume chargé au-delà de la capacité de la citerne est refusé, corriger le volume ou la capacité). Le formulaire affiche le montant, le coût standard de la route et la marge estimée avant l'enregistrement ; la liste montre la marge estimée tant qu'aucun frais n'est saisi. Un clic sur l'en-tête d'une colonne trie toutes les rotations du filtre (pas seulement la page affichée) ; la liste se lit par pages de cent, et un taux sous la marge minimale (Seuils et taux) est signalé.</w:t>
       </w:r>
     </w:p>
     <w:p>
@@ -752,6 +752,35 @@
           <w:szCs w:val="20"/>
         </w:rPr>
         <w:t xml:space="preserve">Sans réseau : la rotation est gardée sur le téléphone (« À envoyer ») et part seule dès que le réseau revient. Une saisie envoyée deux fois n'est créée qu'une fois.</w:t>
+      </w:r>
+    </w:p>
+    <w:p>
+      <w:pPr>
+        <w:tabs>
+          <w:tab w:val="left" w:pos="360"/>
+        </w:tabs>
+        <w:spacing w:after="60"/>
+        <w:ind w:left="360" w:hanging="360"/>
+        <w:jc w:val="both"/>
+      </w:pPr>
+      <w:r>
+        <w:rPr>
+          <w:rFonts w:ascii="Calibri" w:cs="Calibri" w:eastAsia="Calibri" w:hAnsi="Calibri"/>
+          <w:b/>
+          <w:bCs/>
+          <w:color w:val="1A9E9E"/>
+          <w:sz w:val="20"/>
+          <w:szCs w:val="20"/>
+        </w:rPr>
+        <w:t xml:space="preserve">•	</w:t>
+      </w:r>
+      <w:r>
+        <w:rPr>
+          <w:rFonts w:ascii="Calibri" w:cs="Calibri" w:eastAsia="Calibri" w:hAnsi="Calibri"/>
+          <w:sz w:val="20"/>
+          <w:szCs w:val="20"/>
+        </w:rPr>
+        <w:t xml:space="preserve">« Réseau faible » : le téléphone se dit connecté mais le bureau répond mal ou trop lentement. Rien n'est perdu : les saisies restent sur le téléphone et repartent seules ; la barre du bas rappelle la date du dernier envoi réussi.</w:t>
       </w:r>
     </w:p>
     <w:p>

</xml_diff>